<commit_message>
docs: revised code generation
</commit_message>
<xml_diff>
--- a/flutter_documents/f4_networking_and_database/f22_retrofit_code_generation_with_dio.docx
+++ b/flutter_documents/f4_networking_and_database/f22_retrofit_code_generation_with_dio.docx
@@ -325,24 +325,24 @@
         <w:jc w:val="both"/>
         <w:rPr>
           <w:rFonts w:cs="Carlito"/>
-          <w:sz w:val="34"/>
-          <w:szCs w:val="34"/>
-        </w:rPr>
-      </w:pPr>
-    </w:p>
-    <w:p>
-      <w:pPr>
-        <w:rPr>
-          <w:rFonts w:cs="Carlito"/>
-          <w:sz w:val="34"/>
-          <w:szCs w:val="34"/>
-        </w:rPr>
-      </w:pPr>
-      <w:r>
-        <w:rPr>
-          <w:rFonts w:cs="Carlito"/>
-          <w:sz w:val="34"/>
-          <w:szCs w:val="34"/>
+          <w:sz w:val="32"/>
+          <w:szCs w:val="32"/>
+        </w:rPr>
+      </w:pPr>
+    </w:p>
+    <w:p>
+      <w:pPr>
+        <w:rPr>
+          <w:rFonts w:cs="Carlito"/>
+          <w:sz w:val="32"/>
+          <w:szCs w:val="32"/>
+        </w:rPr>
+      </w:pPr>
+      <w:r>
+        <w:rPr>
+          <w:rFonts w:cs="Carlito"/>
+          <w:sz w:val="32"/>
+          <w:szCs w:val="32"/>
         </w:rPr>
         <w:br w:type="page"/>
       </w:r>
@@ -1335,12 +1335,23 @@
           <w:szCs w:val="32"/>
         </w:rPr>
       </w:pPr>
-      <w:r>
-        <w:rPr>
-          <w:rFonts w:cs="Carlito"/>
-          <w:sz w:val="32"/>
-          <w:szCs w:val="32"/>
-        </w:rPr>
+    </w:p>
+    <w:p>
+      <w:pPr>
+        <w:jc w:val="both"/>
+        <w:rPr>
+          <w:rFonts w:cs="Carlito"/>
+          <w:sz w:val="32"/>
+          <w:szCs w:val="32"/>
+        </w:rPr>
+      </w:pPr>
+      <w:r>
+        <w:rPr>
+          <w:rFonts w:cs="Carlito"/>
+          <w:sz w:val="32"/>
+          <w:szCs w:val="32"/>
+        </w:rPr>
+        <w:lastRenderedPageBreak/>
         <w:t>Why Generate Code Instead of Writing It:</w:t>
       </w:r>
     </w:p>
@@ -1359,7 +1370,6 @@
           <w:sz w:val="32"/>
           <w:szCs w:val="32"/>
         </w:rPr>
-        <w:lastRenderedPageBreak/>
         <w:t xml:space="preserve"># </w:t>
       </w:r>
       <w:r>
@@ -2106,694 +2116,1128 @@
           <w:sz w:val="32"/>
           <w:szCs w:val="32"/>
         </w:rPr>
+        <w:t>Mental Model (The Full Pipeline):</w:t>
+      </w:r>
+    </w:p>
+    <w:p>
+      <w:pPr>
+        <w:jc w:val="both"/>
+        <w:rPr>
+          <w:rFonts w:cs="Carlito"/>
+          <w:sz w:val="32"/>
+          <w:szCs w:val="32"/>
+        </w:rPr>
+      </w:pPr>
+      <w:r>
+        <w:rPr>
+          <w:rFonts w:cs="Carlito"/>
+          <w:sz w:val="32"/>
+          <w:szCs w:val="32"/>
+        </w:rPr>
+        <w:t xml:space="preserve"># </w:t>
+      </w:r>
+      <w:r>
+        <w:rPr>
+          <w:rFonts w:cs="Carlito"/>
+          <w:sz w:val="32"/>
+          <w:szCs w:val="32"/>
+        </w:rPr>
+        <w:t>Code generation happens once, at build time, on our machine. It is not reflection, not runtime magic, not something that costs our app performance. By the time our app runs,</w:t>
+      </w:r>
+      <w:r>
+        <w:rPr>
+          <w:rFonts w:cs="Carlito"/>
+          <w:b/>
+          <w:bCs/>
+          <w:sz w:val="32"/>
+          <w:szCs w:val="32"/>
+        </w:rPr>
+        <w:t xml:space="preserve"> _</w:t>
+      </w:r>
+      <w:proofErr w:type="spellStart"/>
+      <w:r>
+        <w:rPr>
+          <w:rFonts w:cs="Carlito"/>
+          <w:b/>
+          <w:bCs/>
+          <w:sz w:val="32"/>
+          <w:szCs w:val="32"/>
+        </w:rPr>
+        <w:t>RestClient</w:t>
+      </w:r>
+      <w:proofErr w:type="spellEnd"/>
+      <w:r>
+        <w:rPr>
+          <w:rFonts w:cs="Carlito"/>
+          <w:b/>
+          <w:bCs/>
+          <w:sz w:val="32"/>
+          <w:szCs w:val="32"/>
+        </w:rPr>
+        <w:t xml:space="preserve"> </w:t>
+      </w:r>
+      <w:r>
+        <w:rPr>
+          <w:rFonts w:cs="Carlito"/>
+          <w:sz w:val="32"/>
+          <w:szCs w:val="32"/>
+        </w:rPr>
+        <w:t xml:space="preserve">is just... a normal </w:t>
+      </w:r>
+      <w:r>
+        <w:rPr>
+          <w:rFonts w:cs="Carlito"/>
+          <w:b/>
+          <w:bCs/>
+          <w:sz w:val="32"/>
+          <w:szCs w:val="32"/>
+        </w:rPr>
+        <w:t>Dart</w:t>
+      </w:r>
+      <w:r>
+        <w:rPr>
+          <w:rFonts w:cs="Carlito"/>
+          <w:sz w:val="32"/>
+          <w:szCs w:val="32"/>
+        </w:rPr>
+        <w:t xml:space="preserve"> class, sitting in </w:t>
+      </w:r>
+      <w:proofErr w:type="gramStart"/>
+      <w:r>
+        <w:rPr>
+          <w:rFonts w:cs="Carlito"/>
+          <w:sz w:val="32"/>
+          <w:szCs w:val="32"/>
+        </w:rPr>
+        <w:t>a</w:t>
+      </w:r>
+      <w:r>
+        <w:rPr>
+          <w:rFonts w:cs="Carlito"/>
+          <w:b/>
+          <w:bCs/>
+          <w:sz w:val="32"/>
+          <w:szCs w:val="32"/>
+        </w:rPr>
+        <w:t xml:space="preserve"> .</w:t>
+      </w:r>
+      <w:proofErr w:type="spellStart"/>
+      <w:r>
+        <w:rPr>
+          <w:rFonts w:cs="Carlito"/>
+          <w:b/>
+          <w:bCs/>
+          <w:sz w:val="32"/>
+          <w:szCs w:val="32"/>
+        </w:rPr>
+        <w:t>g</w:t>
+      </w:r>
+      <w:proofErr w:type="gramEnd"/>
+      <w:r>
+        <w:rPr>
+          <w:rFonts w:cs="Carlito"/>
+          <w:b/>
+          <w:bCs/>
+          <w:sz w:val="32"/>
+          <w:szCs w:val="32"/>
+        </w:rPr>
+        <w:t>.dart</w:t>
+      </w:r>
+      <w:proofErr w:type="spellEnd"/>
+      <w:r>
+        <w:rPr>
+          <w:rFonts w:cs="Carlito"/>
+          <w:b/>
+          <w:bCs/>
+          <w:sz w:val="32"/>
+          <w:szCs w:val="32"/>
+        </w:rPr>
+        <w:t xml:space="preserve"> </w:t>
+      </w:r>
+      <w:r>
+        <w:rPr>
+          <w:rFonts w:cs="Carlito"/>
+          <w:sz w:val="32"/>
+          <w:szCs w:val="32"/>
+        </w:rPr>
+        <w:t xml:space="preserve">file, calling </w:t>
+      </w:r>
+      <w:proofErr w:type="spellStart"/>
+      <w:r>
+        <w:rPr>
+          <w:rFonts w:cs="Carlito"/>
+          <w:b/>
+          <w:bCs/>
+          <w:sz w:val="32"/>
+          <w:szCs w:val="32"/>
+        </w:rPr>
+        <w:t>dio.post</w:t>
+      </w:r>
+      <w:proofErr w:type="spellEnd"/>
+      <w:r>
+        <w:rPr>
+          <w:rFonts w:cs="Carlito"/>
+          <w:b/>
+          <w:bCs/>
+          <w:sz w:val="32"/>
+          <w:szCs w:val="32"/>
+        </w:rPr>
+        <w:t>()</w:t>
+      </w:r>
+      <w:r>
+        <w:rPr>
+          <w:rFonts w:cs="Carlito"/>
+          <w:sz w:val="32"/>
+          <w:szCs w:val="32"/>
+        </w:rPr>
+        <w:t xml:space="preserve"> exactly like we'd have written by hand</w:t>
+      </w:r>
+    </w:p>
+    <w:p>
+      <w:pPr>
+        <w:jc w:val="both"/>
+        <w:rPr>
+          <w:rFonts w:cs="Carlito"/>
+          <w:b/>
+          <w:bCs/>
+        </w:rPr>
+      </w:pPr>
+      <w:r>
+        <w:rPr>
+          <w:rFonts w:cs="Carlito"/>
+          <w:b/>
+          <w:bCs/>
+        </w:rPr>
+        <w:t>┌─────────────────────────────┐</w:t>
+      </w:r>
+    </w:p>
+    <w:p>
+      <w:pPr>
+        <w:jc w:val="both"/>
+        <w:rPr>
+          <w:rFonts w:cs="Carlito"/>
+          <w:b/>
+          <w:bCs/>
+        </w:rPr>
+      </w:pPr>
+      <w:r>
+        <w:rPr>
+          <w:rFonts w:cs="Carlito"/>
+          <w:b/>
+          <w:bCs/>
+        </w:rPr>
+        <w:t xml:space="preserve">│           </w:t>
+      </w:r>
+      <w:proofErr w:type="spellStart"/>
+      <w:r>
+        <w:rPr>
+          <w:rFonts w:cs="Carlito"/>
+          <w:b/>
+          <w:bCs/>
+        </w:rPr>
+        <w:t>rest_</w:t>
+      </w:r>
+      <w:proofErr w:type="gramStart"/>
+      <w:r>
+        <w:rPr>
+          <w:rFonts w:cs="Carlito"/>
+          <w:b/>
+          <w:bCs/>
+        </w:rPr>
+        <w:t>client.dart</w:t>
+      </w:r>
+      <w:proofErr w:type="spellEnd"/>
+      <w:proofErr w:type="gramEnd"/>
+      <w:r>
+        <w:rPr>
+          <w:rFonts w:cs="Carlito"/>
+          <w:b/>
+          <w:bCs/>
+        </w:rPr>
+        <w:t xml:space="preserve"> (ours)            </w:t>
+      </w:r>
+      <w:r>
+        <w:rPr>
+          <w:rFonts w:cs="Carlito"/>
+          <w:b/>
+          <w:bCs/>
+        </w:rPr>
+        <w:t xml:space="preserve"> </w:t>
+      </w:r>
+      <w:r>
+        <w:rPr>
+          <w:rFonts w:cs="Carlito"/>
+          <w:b/>
+          <w:bCs/>
+        </w:rPr>
+        <w:t>│   ← abstract class, annotations, NO logic</w:t>
+      </w:r>
+    </w:p>
+    <w:p>
+      <w:pPr>
+        <w:jc w:val="both"/>
+        <w:rPr>
+          <w:rFonts w:cs="Carlito"/>
+          <w:b/>
+          <w:bCs/>
+        </w:rPr>
+      </w:pPr>
+      <w:r>
+        <w:rPr>
+          <w:rFonts w:cs="Carlito"/>
+          <w:b/>
+          <w:bCs/>
+        </w:rPr>
+        <w:t>│           @</w:t>
+      </w:r>
+      <w:proofErr w:type="gramStart"/>
+      <w:r>
+        <w:rPr>
+          <w:rFonts w:cs="Carlito"/>
+          <w:b/>
+          <w:bCs/>
+        </w:rPr>
+        <w:t>POST(</w:t>
+      </w:r>
+      <w:proofErr w:type="gramEnd"/>
+      <w:r>
+        <w:rPr>
+          <w:rFonts w:cs="Carlito"/>
+          <w:b/>
+          <w:bCs/>
+        </w:rPr>
+        <w:t>Endpoints.login)       │</w:t>
+      </w:r>
+    </w:p>
+    <w:p>
+      <w:pPr>
+        <w:jc w:val="both"/>
+        <w:rPr>
+          <w:rFonts w:cs="Carlito"/>
+          <w:b/>
+          <w:bCs/>
+        </w:rPr>
+      </w:pPr>
+      <w:r>
+        <w:rPr>
+          <w:rFonts w:cs="Carlito"/>
+          <w:b/>
+          <w:bCs/>
+        </w:rPr>
+        <w:t>│           Future&lt;</w:t>
+      </w:r>
+      <w:proofErr w:type="spellStart"/>
+      <w:r>
+        <w:rPr>
+          <w:rFonts w:cs="Carlito"/>
+          <w:b/>
+          <w:bCs/>
+        </w:rPr>
+        <w:t>HttpResponse</w:t>
+      </w:r>
+      <w:proofErr w:type="spellEnd"/>
+      <w:r>
+        <w:rPr>
+          <w:rFonts w:cs="Carlito"/>
+          <w:b/>
+          <w:bCs/>
+        </w:rPr>
+        <w:t>&gt;         │</w:t>
+      </w:r>
+    </w:p>
+    <w:p>
+      <w:pPr>
+        <w:jc w:val="both"/>
+        <w:rPr>
+          <w:rFonts w:cs="Carlito"/>
+          <w:b/>
+          <w:bCs/>
+        </w:rPr>
+      </w:pPr>
+      <w:r>
+        <w:rPr>
+          <w:rFonts w:cs="Carlito"/>
+          <w:b/>
+          <w:bCs/>
+        </w:rPr>
+        <w:t>│           login(@</w:t>
+      </w:r>
+      <w:proofErr w:type="gramStart"/>
+      <w:r>
+        <w:rPr>
+          <w:rFonts w:cs="Carlito"/>
+          <w:b/>
+          <w:bCs/>
+        </w:rPr>
+        <w:t>Body(</w:t>
+      </w:r>
+      <w:proofErr w:type="gramEnd"/>
+      <w:r>
+        <w:rPr>
+          <w:rFonts w:cs="Carlito"/>
+          <w:b/>
+          <w:bCs/>
+        </w:rPr>
+        <w:t xml:space="preserve">) ...);                   </w:t>
+      </w:r>
+      <w:r>
+        <w:rPr>
+          <w:rFonts w:cs="Carlito"/>
+          <w:b/>
+          <w:bCs/>
+        </w:rPr>
+        <w:t xml:space="preserve"> </w:t>
+      </w:r>
+      <w:r>
+        <w:rPr>
+          <w:rFonts w:cs="Carlito"/>
+          <w:b/>
+          <w:bCs/>
+        </w:rPr>
+        <w:t>│</w:t>
+      </w:r>
+    </w:p>
+    <w:p>
+      <w:pPr>
+        <w:jc w:val="both"/>
+        <w:rPr>
+          <w:rFonts w:cs="Carlito"/>
+          <w:b/>
+          <w:bCs/>
+        </w:rPr>
+      </w:pPr>
+      <w:r>
+        <w:rPr>
+          <w:rFonts w:cs="Carlito"/>
+          <w:b/>
+          <w:bCs/>
+        </w:rPr>
+        <w:t>└──────────────</w:t>
+      </w:r>
+      <w:r>
+        <w:rPr>
+          <w:rFonts w:ascii="Arial" w:hAnsi="Arial" w:cs="Arial"/>
+          <w:b/>
+          <w:bCs/>
+        </w:rPr>
+        <w:t>┬</w:t>
+      </w:r>
+      <w:r>
+        <w:rPr>
+          <w:rFonts w:cs="Carlito"/>
+          <w:b/>
+          <w:bCs/>
+        </w:rPr>
+        <w:t>─────────────┘</w:t>
+      </w:r>
+    </w:p>
+    <w:p>
+      <w:pPr>
+        <w:jc w:val="both"/>
+        <w:rPr>
+          <w:rFonts w:cs="Carlito"/>
+          <w:b/>
+          <w:bCs/>
+        </w:rPr>
+      </w:pPr>
+      <w:r>
+        <w:rPr>
+          <w:rFonts w:cs="Carlito"/>
+          <w:b/>
+          <w:bCs/>
+        </w:rPr>
+        <w:t xml:space="preserve">                                 </w:t>
+      </w:r>
+      <w:proofErr w:type="gramStart"/>
+      <w:r>
+        <w:rPr>
+          <w:rFonts w:cs="Carlito"/>
+          <w:b/>
+          <w:bCs/>
+        </w:rPr>
+        <w:t>│  we</w:t>
+      </w:r>
+      <w:proofErr w:type="gramEnd"/>
+      <w:r>
+        <w:rPr>
+          <w:rFonts w:cs="Carlito"/>
+          <w:b/>
+          <w:bCs/>
+        </w:rPr>
+        <w:t xml:space="preserve"> run: dart run </w:t>
+      </w:r>
+      <w:proofErr w:type="spellStart"/>
+      <w:r>
+        <w:rPr>
+          <w:rFonts w:cs="Carlito"/>
+          <w:b/>
+          <w:bCs/>
+        </w:rPr>
+        <w:t>build_runner</w:t>
+      </w:r>
+      <w:proofErr w:type="spellEnd"/>
+      <w:r>
+        <w:rPr>
+          <w:rFonts w:cs="Carlito"/>
+          <w:b/>
+          <w:bCs/>
+        </w:rPr>
+        <w:t xml:space="preserve"> build</w:t>
+      </w:r>
+    </w:p>
+    <w:p>
+      <w:pPr>
+        <w:jc w:val="both"/>
+        <w:rPr>
+          <w:rFonts w:cs="Carlito"/>
+          <w:b/>
+          <w:bCs/>
+        </w:rPr>
+      </w:pPr>
+      <w:r>
+        <w:rPr>
+          <w:rFonts w:cs="Carlito"/>
+          <w:b/>
+          <w:bCs/>
+        </w:rPr>
+        <w:t xml:space="preserve">                                </w:t>
+      </w:r>
+      <w:r>
+        <w:rPr>
+          <w:rFonts w:ascii="Arial" w:hAnsi="Arial" w:cs="Arial"/>
+          <w:b/>
+          <w:bCs/>
+        </w:rPr>
+        <w:t>▼</w:t>
+      </w:r>
+    </w:p>
+    <w:p>
+      <w:pPr>
+        <w:jc w:val="both"/>
+        <w:rPr>
+          <w:rFonts w:cs="Carlito"/>
+          <w:b/>
+          <w:bCs/>
+        </w:rPr>
+      </w:pPr>
+      <w:r>
+        <w:rPr>
+          <w:rFonts w:cs="Carlito"/>
+          <w:b/>
+          <w:bCs/>
+        </w:rPr>
+        <w:t>┌─────────────────────────────┐</w:t>
+      </w:r>
+    </w:p>
+    <w:p>
+      <w:pPr>
+        <w:jc w:val="both"/>
+        <w:rPr>
+          <w:rFonts w:cs="Carlito"/>
+          <w:b/>
+          <w:bCs/>
+        </w:rPr>
+      </w:pPr>
+      <w:proofErr w:type="gramStart"/>
+      <w:r>
+        <w:rPr>
+          <w:rFonts w:cs="Carlito"/>
+          <w:b/>
+          <w:bCs/>
+        </w:rPr>
+        <w:t xml:space="preserve">│  </w:t>
+      </w:r>
+      <w:proofErr w:type="spellStart"/>
+      <w:r>
+        <w:rPr>
+          <w:rFonts w:cs="Carlito"/>
+          <w:b/>
+          <w:bCs/>
+        </w:rPr>
+        <w:t>source</w:t>
+      </w:r>
+      <w:proofErr w:type="gramEnd"/>
+      <w:r>
+        <w:rPr>
+          <w:rFonts w:cs="Carlito"/>
+          <w:b/>
+          <w:bCs/>
+        </w:rPr>
+        <w:t>_gen</w:t>
+      </w:r>
+      <w:proofErr w:type="spellEnd"/>
+      <w:r>
+        <w:rPr>
+          <w:rFonts w:cs="Carlito"/>
+          <w:b/>
+          <w:bCs/>
+        </w:rPr>
+        <w:t xml:space="preserve"> + </w:t>
+      </w:r>
+      <w:proofErr w:type="spellStart"/>
+      <w:r>
+        <w:rPr>
+          <w:rFonts w:cs="Carlito"/>
+          <w:b/>
+          <w:bCs/>
+        </w:rPr>
+        <w:t>retrofit_generator</w:t>
+      </w:r>
+      <w:proofErr w:type="spellEnd"/>
+      <w:r>
+        <w:rPr>
+          <w:rFonts w:cs="Carlito"/>
+          <w:b/>
+          <w:bCs/>
+        </w:rPr>
+        <w:t xml:space="preserve"> </w:t>
+      </w:r>
+      <w:r>
+        <w:rPr>
+          <w:rFonts w:cs="Carlito"/>
+          <w:b/>
+          <w:bCs/>
+        </w:rPr>
+        <w:t xml:space="preserve">   </w:t>
+      </w:r>
+      <w:r>
+        <w:rPr>
+          <w:rFonts w:cs="Carlito"/>
+          <w:b/>
+          <w:bCs/>
+        </w:rPr>
+        <w:t>│  ← reads our annotations</w:t>
+      </w:r>
+    </w:p>
+    <w:p>
+      <w:pPr>
+        <w:jc w:val="both"/>
+        <w:rPr>
+          <w:rFonts w:cs="Carlito"/>
+          <w:b/>
+          <w:bCs/>
+        </w:rPr>
+      </w:pPr>
+      <w:proofErr w:type="gramStart"/>
+      <w:r>
+        <w:rPr>
+          <w:rFonts w:cs="Carlito"/>
+          <w:b/>
+          <w:bCs/>
+        </w:rPr>
+        <w:t>│  (</w:t>
+      </w:r>
+      <w:proofErr w:type="gramEnd"/>
+      <w:r>
+        <w:rPr>
+          <w:rFonts w:cs="Carlito"/>
+          <w:b/>
+          <w:bCs/>
+        </w:rPr>
+        <w:t xml:space="preserve">build-time tool, not runtime)  </w:t>
+      </w:r>
+      <w:r>
+        <w:rPr>
+          <w:rFonts w:cs="Carlito"/>
+          <w:b/>
+          <w:bCs/>
+        </w:rPr>
+        <w:t xml:space="preserve">      </w:t>
+      </w:r>
+      <w:r>
+        <w:rPr>
+          <w:rFonts w:cs="Carlito"/>
+          <w:b/>
+          <w:bCs/>
+        </w:rPr>
+        <w:t>│     writes real Dio calls</w:t>
+      </w:r>
+    </w:p>
+    <w:p>
+      <w:pPr>
+        <w:jc w:val="both"/>
+        <w:rPr>
+          <w:rFonts w:cs="Carlito"/>
+          <w:b/>
+          <w:bCs/>
+        </w:rPr>
+      </w:pPr>
+      <w:r>
+        <w:rPr>
+          <w:rFonts w:cs="Carlito"/>
+          <w:b/>
+          <w:bCs/>
+        </w:rPr>
+        <w:t>└──────────────</w:t>
+      </w:r>
+      <w:r>
+        <w:rPr>
+          <w:rFonts w:ascii="Arial" w:hAnsi="Arial" w:cs="Arial"/>
+          <w:b/>
+          <w:bCs/>
+        </w:rPr>
+        <w:t>┬</w:t>
+      </w:r>
+      <w:r>
+        <w:rPr>
+          <w:rFonts w:cs="Carlito"/>
+          <w:b/>
+          <w:bCs/>
+        </w:rPr>
+        <w:t>──────────────┘</w:t>
+      </w:r>
+    </w:p>
+    <w:p>
+      <w:pPr>
+        <w:jc w:val="both"/>
+        <w:rPr>
+          <w:rFonts w:cs="Carlito"/>
+          <w:b/>
+          <w:bCs/>
+        </w:rPr>
+      </w:pPr>
+      <w:r>
+        <w:rPr>
+          <w:rFonts w:cs="Carlito"/>
+          <w:b/>
+          <w:bCs/>
+        </w:rPr>
+        <w:t xml:space="preserve">           </w:t>
+      </w:r>
+      <w:r>
+        <w:rPr>
+          <w:rFonts w:cs="Carlito"/>
+          <w:b/>
+          <w:bCs/>
+        </w:rPr>
+        <w:t xml:space="preserve">                   </w:t>
+      </w:r>
+      <w:r>
+        <w:rPr>
+          <w:rFonts w:cs="Carlito"/>
+          <w:b/>
+          <w:bCs/>
+        </w:rPr>
+        <w:t xml:space="preserve">    │</w:t>
+      </w:r>
+    </w:p>
+    <w:p>
+      <w:pPr>
+        <w:jc w:val="both"/>
+        <w:rPr>
+          <w:rFonts w:cs="Carlito"/>
+          <w:b/>
+          <w:bCs/>
+        </w:rPr>
+      </w:pPr>
+      <w:r>
+        <w:rPr>
+          <w:rFonts w:cs="Carlito"/>
+          <w:b/>
+          <w:bCs/>
+        </w:rPr>
+        <w:t xml:space="preserve">              </w:t>
+      </w:r>
+      <w:r>
+        <w:rPr>
+          <w:rFonts w:cs="Carlito"/>
+          <w:b/>
+          <w:bCs/>
+        </w:rPr>
+        <w:t xml:space="preserve">                  </w:t>
+      </w:r>
+      <w:r>
+        <w:rPr>
+          <w:rFonts w:cs="Carlito"/>
+          <w:b/>
+          <w:bCs/>
+        </w:rPr>
+        <w:t xml:space="preserve"> </w:t>
+      </w:r>
+      <w:r>
+        <w:rPr>
+          <w:rFonts w:ascii="Arial" w:hAnsi="Arial" w:cs="Arial"/>
+          <w:b/>
+          <w:bCs/>
+        </w:rPr>
+        <w:t>▼</w:t>
+      </w:r>
+    </w:p>
+    <w:p>
+      <w:pPr>
+        <w:jc w:val="both"/>
+        <w:rPr>
+          <w:rFonts w:cs="Carlito"/>
+          <w:b/>
+          <w:bCs/>
+        </w:rPr>
+      </w:pPr>
+      <w:r>
+        <w:rPr>
+          <w:rFonts w:cs="Carlito"/>
+          <w:b/>
+          <w:bCs/>
+        </w:rPr>
+        <w:t>┌─────────────────────────────┐</w:t>
+      </w:r>
+    </w:p>
+    <w:p>
+      <w:pPr>
+        <w:jc w:val="both"/>
+        <w:rPr>
+          <w:rFonts w:cs="Carlito"/>
+          <w:b/>
+          <w:bCs/>
+        </w:rPr>
+      </w:pPr>
+      <w:proofErr w:type="gramStart"/>
+      <w:r>
+        <w:rPr>
+          <w:rFonts w:cs="Carlito"/>
+          <w:b/>
+          <w:bCs/>
+        </w:rPr>
+        <w:t xml:space="preserve">│  </w:t>
+      </w:r>
+      <w:proofErr w:type="spellStart"/>
+      <w:r>
+        <w:rPr>
+          <w:rFonts w:cs="Carlito"/>
+          <w:b/>
+          <w:bCs/>
+        </w:rPr>
+        <w:t>rest</w:t>
+      </w:r>
+      <w:proofErr w:type="gramEnd"/>
+      <w:r>
+        <w:rPr>
+          <w:rFonts w:cs="Carlito"/>
+          <w:b/>
+          <w:bCs/>
+        </w:rPr>
+        <w:t>_client.g.dart</w:t>
+      </w:r>
+      <w:proofErr w:type="spellEnd"/>
+      <w:r>
+        <w:rPr>
+          <w:rFonts w:cs="Carlito"/>
+          <w:b/>
+          <w:bCs/>
+        </w:rPr>
+        <w:t xml:space="preserve"> (generated)</w:t>
+      </w:r>
+      <w:r>
+        <w:rPr>
+          <w:rFonts w:cs="Carlito"/>
+          <w:b/>
+          <w:bCs/>
+        </w:rPr>
+        <w:t xml:space="preserve">        </w:t>
+      </w:r>
+      <w:r>
+        <w:rPr>
+          <w:rFonts w:cs="Carlito"/>
+          <w:b/>
+          <w:bCs/>
+        </w:rPr>
+        <w:t>│  ← _</w:t>
+      </w:r>
+      <w:proofErr w:type="spellStart"/>
+      <w:r>
+        <w:rPr>
+          <w:rFonts w:cs="Carlito"/>
+          <w:b/>
+          <w:bCs/>
+        </w:rPr>
+        <w:t>RestClient</w:t>
+      </w:r>
+      <w:proofErr w:type="spellEnd"/>
+      <w:r>
+        <w:rPr>
+          <w:rFonts w:cs="Carlito"/>
+          <w:b/>
+          <w:bCs/>
+        </w:rPr>
+        <w:t xml:space="preserve"> class lives here</w:t>
+      </w:r>
+    </w:p>
+    <w:p>
+      <w:pPr>
+        <w:jc w:val="both"/>
+        <w:rPr>
+          <w:rFonts w:cs="Carlito"/>
+          <w:b/>
+          <w:bCs/>
+        </w:rPr>
+      </w:pPr>
+      <w:proofErr w:type="gramStart"/>
+      <w:r>
+        <w:rPr>
+          <w:rFonts w:cs="Carlito"/>
+          <w:b/>
+          <w:bCs/>
+        </w:rPr>
+        <w:t>│  class</w:t>
+      </w:r>
+      <w:proofErr w:type="gramEnd"/>
+      <w:r>
+        <w:rPr>
+          <w:rFonts w:cs="Carlito"/>
+          <w:b/>
+          <w:bCs/>
+        </w:rPr>
+        <w:t xml:space="preserve"> _</w:t>
+      </w:r>
+      <w:proofErr w:type="spellStart"/>
+      <w:r>
+        <w:rPr>
+          <w:rFonts w:cs="Carlito"/>
+          <w:b/>
+          <w:bCs/>
+        </w:rPr>
+        <w:t>RestClient</w:t>
+      </w:r>
+      <w:proofErr w:type="spellEnd"/>
+      <w:r>
+        <w:rPr>
+          <w:rFonts w:cs="Carlito"/>
+          <w:b/>
+          <w:bCs/>
+        </w:rPr>
+        <w:t xml:space="preserve"> extends    </w:t>
+      </w:r>
+      <w:r>
+        <w:rPr>
+          <w:rFonts w:cs="Carlito"/>
+          <w:b/>
+          <w:bCs/>
+        </w:rPr>
+        <w:t xml:space="preserve">           </w:t>
+      </w:r>
+      <w:r>
+        <w:rPr>
+          <w:rFonts w:cs="Carlito"/>
+          <w:b/>
+          <w:bCs/>
+        </w:rPr>
+        <w:t xml:space="preserve"> │     ACTUAL </w:t>
+      </w:r>
+      <w:proofErr w:type="spellStart"/>
+      <w:r>
+        <w:rPr>
+          <w:rFonts w:cs="Carlito"/>
+          <w:b/>
+          <w:bCs/>
+        </w:rPr>
+        <w:t>dio.post</w:t>
+      </w:r>
+      <w:proofErr w:type="spellEnd"/>
+      <w:r>
+        <w:rPr>
+          <w:rFonts w:cs="Carlito"/>
+          <w:b/>
+          <w:bCs/>
+        </w:rPr>
+        <w:t>(...) calls</w:t>
+      </w:r>
+    </w:p>
+    <w:p>
+      <w:pPr>
+        <w:jc w:val="both"/>
+        <w:rPr>
+          <w:rFonts w:cs="Carlito"/>
+          <w:b/>
+          <w:bCs/>
+        </w:rPr>
+      </w:pPr>
+      <w:r>
+        <w:rPr>
+          <w:rFonts w:cs="Carlito"/>
+          <w:b/>
+          <w:bCs/>
+        </w:rPr>
+        <w:t xml:space="preserve">│    </w:t>
+      </w:r>
+      <w:proofErr w:type="spellStart"/>
+      <w:r>
+        <w:rPr>
+          <w:rFonts w:cs="Carlito"/>
+          <w:b/>
+          <w:bCs/>
+        </w:rPr>
+        <w:t>RestClient</w:t>
+      </w:r>
+      <w:proofErr w:type="spellEnd"/>
+      <w:r>
+        <w:rPr>
+          <w:rFonts w:cs="Carlito"/>
+          <w:b/>
+          <w:bCs/>
+        </w:rPr>
+        <w:t xml:space="preserve"> </w:t>
+      </w:r>
+      <w:proofErr w:type="gramStart"/>
+      <w:r>
+        <w:rPr>
+          <w:rFonts w:cs="Carlito"/>
+          <w:b/>
+          <w:bCs/>
+        </w:rPr>
+        <w:t xml:space="preserve">{  </w:t>
+      </w:r>
+      <w:proofErr w:type="gramEnd"/>
+      <w:r>
+        <w:rPr>
+          <w:rFonts w:cs="Carlito"/>
+          <w:b/>
+          <w:bCs/>
+        </w:rPr>
+        <w:t xml:space="preserve">            </w:t>
+      </w:r>
+      <w:r>
+        <w:rPr>
+          <w:rFonts w:cs="Carlito"/>
+          <w:b/>
+          <w:bCs/>
+        </w:rPr>
+        <w:t xml:space="preserve">                       </w:t>
+      </w:r>
+      <w:r>
+        <w:rPr>
+          <w:rFonts w:cs="Carlito"/>
+          <w:b/>
+          <w:bCs/>
+        </w:rPr>
+        <w:t xml:space="preserve">  │     written FOR </w:t>
+      </w:r>
+      <w:r>
+        <w:rPr>
+          <w:rFonts w:cs="Carlito"/>
+          <w:b/>
+          <w:bCs/>
+        </w:rPr>
+        <w:t>us</w:t>
+      </w:r>
+    </w:p>
+    <w:p>
+      <w:pPr>
+        <w:jc w:val="both"/>
+        <w:rPr>
+          <w:rFonts w:cs="Carlito"/>
+          <w:b/>
+          <w:bCs/>
+        </w:rPr>
+      </w:pPr>
+      <w:r>
+        <w:rPr>
+          <w:rFonts w:cs="Carlito"/>
+          <w:b/>
+          <w:bCs/>
+        </w:rPr>
+        <w:t xml:space="preserve">│    ...real implementation...   </w:t>
+      </w:r>
+      <w:r>
+        <w:rPr>
+          <w:rFonts w:cs="Carlito"/>
+          <w:b/>
+          <w:bCs/>
+        </w:rPr>
+        <w:t xml:space="preserve">            </w:t>
+      </w:r>
+      <w:r>
+        <w:rPr>
+          <w:rFonts w:cs="Carlito"/>
+          <w:b/>
+          <w:bCs/>
+        </w:rPr>
+        <w:t>│</w:t>
+      </w:r>
+    </w:p>
+    <w:p>
+      <w:pPr>
+        <w:jc w:val="both"/>
+        <w:rPr>
+          <w:rFonts w:cs="Carlito"/>
+          <w:b/>
+          <w:bCs/>
+        </w:rPr>
+      </w:pPr>
+      <w:r>
+        <w:rPr>
+          <w:rFonts w:cs="Carlito"/>
+          <w:b/>
+          <w:bCs/>
+        </w:rPr>
+        <w:t xml:space="preserve">│  }                              </w:t>
+      </w:r>
+      <w:r>
+        <w:rPr>
+          <w:rFonts w:cs="Carlito"/>
+          <w:b/>
+          <w:bCs/>
+        </w:rPr>
+        <w:t xml:space="preserve">                              </w:t>
+      </w:r>
+      <w:r>
+        <w:rPr>
+          <w:rFonts w:cs="Carlito"/>
+          <w:b/>
+          <w:bCs/>
+        </w:rPr>
+        <w:t>│</w:t>
+      </w:r>
+    </w:p>
+    <w:p>
+      <w:pPr>
+        <w:jc w:val="both"/>
+        <w:rPr>
+          <w:rFonts w:cs="Carlito"/>
+          <w:b/>
+          <w:bCs/>
+        </w:rPr>
+      </w:pPr>
+      <w:r>
+        <w:rPr>
+          <w:rFonts w:cs="Carlito"/>
+          <w:b/>
+          <w:bCs/>
+        </w:rPr>
+        <w:t>└──────────────</w:t>
+      </w:r>
+      <w:r>
+        <w:rPr>
+          <w:rFonts w:ascii="Arial" w:hAnsi="Arial" w:cs="Arial"/>
+          <w:b/>
+          <w:bCs/>
+        </w:rPr>
+        <w:t>┬</w:t>
+      </w:r>
+      <w:r>
+        <w:rPr>
+          <w:rFonts w:cs="Carlito"/>
+          <w:b/>
+          <w:bCs/>
+        </w:rPr>
+        <w:t>─────────────┘</w:t>
+      </w:r>
+    </w:p>
+    <w:p>
+      <w:pPr>
+        <w:jc w:val="both"/>
+        <w:rPr>
+          <w:rFonts w:cs="Carlito"/>
+          <w:b/>
+          <w:bCs/>
+        </w:rPr>
+      </w:pPr>
+      <w:r>
+        <w:rPr>
+          <w:rFonts w:cs="Carlito"/>
+          <w:b/>
+          <w:bCs/>
+        </w:rPr>
         <w:lastRenderedPageBreak/>
-        <w:t>Mental Model (The Full Pipeline):</w:t>
-      </w:r>
-    </w:p>
-    <w:p>
-      <w:pPr>
-        <w:jc w:val="both"/>
-        <w:rPr>
-          <w:rFonts w:cs="Carlito"/>
-          <w:sz w:val="32"/>
-          <w:szCs w:val="32"/>
-        </w:rPr>
-      </w:pPr>
-      <w:r>
-        <w:rPr>
-          <w:rFonts w:cs="Carlito"/>
-          <w:sz w:val="32"/>
-          <w:szCs w:val="32"/>
-        </w:rPr>
-        <w:t xml:space="preserve"># </w:t>
-      </w:r>
-      <w:r>
-        <w:rPr>
-          <w:rFonts w:cs="Carlito"/>
-          <w:sz w:val="32"/>
-          <w:szCs w:val="32"/>
-        </w:rPr>
-        <w:t>Code generation happens once, at build time, on our machine. It is not reflection, not runtime magic, not something that costs our app performance. By the time our app runs,</w:t>
-      </w:r>
-      <w:r>
-        <w:rPr>
-          <w:rFonts w:cs="Carlito"/>
-          <w:b/>
-          <w:bCs/>
-          <w:sz w:val="32"/>
-          <w:szCs w:val="32"/>
-        </w:rPr>
-        <w:t xml:space="preserve"> _</w:t>
-      </w:r>
-      <w:proofErr w:type="spellStart"/>
-      <w:r>
-        <w:rPr>
-          <w:rFonts w:cs="Carlito"/>
-          <w:b/>
-          <w:bCs/>
-          <w:sz w:val="32"/>
-          <w:szCs w:val="32"/>
-        </w:rPr>
-        <w:t>RestClient</w:t>
-      </w:r>
-      <w:proofErr w:type="spellEnd"/>
-      <w:r>
-        <w:rPr>
-          <w:rFonts w:cs="Carlito"/>
-          <w:b/>
-          <w:bCs/>
-          <w:sz w:val="32"/>
-          <w:szCs w:val="32"/>
-        </w:rPr>
-        <w:t xml:space="preserve"> </w:t>
-      </w:r>
-      <w:r>
-        <w:rPr>
-          <w:rFonts w:cs="Carlito"/>
-          <w:sz w:val="32"/>
-          <w:szCs w:val="32"/>
-        </w:rPr>
-        <w:t xml:space="preserve">is just... a normal </w:t>
-      </w:r>
-      <w:r>
-        <w:rPr>
-          <w:rFonts w:cs="Carlito"/>
-          <w:b/>
-          <w:bCs/>
-          <w:sz w:val="32"/>
-          <w:szCs w:val="32"/>
-        </w:rPr>
-        <w:t>Dart</w:t>
-      </w:r>
-      <w:r>
-        <w:rPr>
-          <w:rFonts w:cs="Carlito"/>
-          <w:sz w:val="32"/>
-          <w:szCs w:val="32"/>
-        </w:rPr>
-        <w:t xml:space="preserve"> class, sitting in </w:t>
-      </w:r>
-      <w:proofErr w:type="gramStart"/>
-      <w:r>
-        <w:rPr>
-          <w:rFonts w:cs="Carlito"/>
-          <w:sz w:val="32"/>
-          <w:szCs w:val="32"/>
-        </w:rPr>
-        <w:t>a</w:t>
-      </w:r>
-      <w:r>
-        <w:rPr>
-          <w:rFonts w:cs="Carlito"/>
-          <w:b/>
-          <w:bCs/>
-          <w:sz w:val="32"/>
-          <w:szCs w:val="32"/>
-        </w:rPr>
-        <w:t xml:space="preserve"> .</w:t>
-      </w:r>
-      <w:proofErr w:type="spellStart"/>
-      <w:r>
-        <w:rPr>
-          <w:rFonts w:cs="Carlito"/>
-          <w:b/>
-          <w:bCs/>
-          <w:sz w:val="32"/>
-          <w:szCs w:val="32"/>
-        </w:rPr>
-        <w:t>g</w:t>
-      </w:r>
-      <w:proofErr w:type="gramEnd"/>
-      <w:r>
-        <w:rPr>
-          <w:rFonts w:cs="Carlito"/>
-          <w:b/>
-          <w:bCs/>
-          <w:sz w:val="32"/>
-          <w:szCs w:val="32"/>
-        </w:rPr>
-        <w:t>.dart</w:t>
-      </w:r>
-      <w:proofErr w:type="spellEnd"/>
-      <w:r>
-        <w:rPr>
-          <w:rFonts w:cs="Carlito"/>
-          <w:b/>
-          <w:bCs/>
-          <w:sz w:val="32"/>
-          <w:szCs w:val="32"/>
-        </w:rPr>
-        <w:t xml:space="preserve"> </w:t>
-      </w:r>
-      <w:r>
-        <w:rPr>
-          <w:rFonts w:cs="Carlito"/>
-          <w:sz w:val="32"/>
-          <w:szCs w:val="32"/>
-        </w:rPr>
-        <w:t xml:space="preserve">file, calling </w:t>
-      </w:r>
-      <w:proofErr w:type="spellStart"/>
-      <w:r>
-        <w:rPr>
-          <w:rFonts w:cs="Carlito"/>
-          <w:b/>
-          <w:bCs/>
-          <w:sz w:val="32"/>
-          <w:szCs w:val="32"/>
-        </w:rPr>
-        <w:t>dio.post</w:t>
-      </w:r>
-      <w:proofErr w:type="spellEnd"/>
-      <w:r>
-        <w:rPr>
-          <w:rFonts w:cs="Carlito"/>
-          <w:b/>
-          <w:bCs/>
-          <w:sz w:val="32"/>
-          <w:szCs w:val="32"/>
-        </w:rPr>
-        <w:t>()</w:t>
-      </w:r>
-      <w:r>
-        <w:rPr>
-          <w:rFonts w:cs="Carlito"/>
-          <w:sz w:val="32"/>
-          <w:szCs w:val="32"/>
-        </w:rPr>
-        <w:t xml:space="preserve"> exactly like we'd have written by hand</w:t>
-      </w:r>
-    </w:p>
-    <w:p>
-      <w:pPr>
-        <w:jc w:val="both"/>
-        <w:rPr>
-          <w:rFonts w:cs="Carlito"/>
-          <w:b/>
-          <w:bCs/>
-        </w:rPr>
-      </w:pPr>
-      <w:r>
-        <w:rPr>
-          <w:rFonts w:cs="Carlito"/>
-          <w:b/>
-          <w:bCs/>
-        </w:rPr>
-        <w:t>┌─────────────────────────────┐</w:t>
-      </w:r>
-    </w:p>
-    <w:p>
-      <w:pPr>
-        <w:jc w:val="both"/>
-        <w:rPr>
-          <w:rFonts w:cs="Carlito"/>
-          <w:b/>
-          <w:bCs/>
-        </w:rPr>
-      </w:pPr>
-      <w:r>
-        <w:rPr>
-          <w:rFonts w:cs="Carlito"/>
-          <w:b/>
-          <w:bCs/>
-        </w:rPr>
-        <w:t xml:space="preserve">│           </w:t>
-      </w:r>
-      <w:proofErr w:type="spellStart"/>
-      <w:r>
-        <w:rPr>
-          <w:rFonts w:cs="Carlito"/>
-          <w:b/>
-          <w:bCs/>
-        </w:rPr>
-        <w:t>rest_</w:t>
-      </w:r>
-      <w:proofErr w:type="gramStart"/>
-      <w:r>
-        <w:rPr>
-          <w:rFonts w:cs="Carlito"/>
-          <w:b/>
-          <w:bCs/>
-        </w:rPr>
-        <w:t>client.dart</w:t>
-      </w:r>
-      <w:proofErr w:type="spellEnd"/>
-      <w:proofErr w:type="gramEnd"/>
-      <w:r>
-        <w:rPr>
-          <w:rFonts w:cs="Carlito"/>
-          <w:b/>
-          <w:bCs/>
-        </w:rPr>
-        <w:t xml:space="preserve"> (ours)            </w:t>
-      </w:r>
-      <w:r>
-        <w:rPr>
-          <w:rFonts w:cs="Carlito"/>
-          <w:b/>
-          <w:bCs/>
-        </w:rPr>
-        <w:t xml:space="preserve"> </w:t>
-      </w:r>
-      <w:r>
-        <w:rPr>
-          <w:rFonts w:cs="Carlito"/>
-          <w:b/>
-          <w:bCs/>
-        </w:rPr>
-        <w:t>│   ← abstract class, annotations, NO logic</w:t>
-      </w:r>
-    </w:p>
-    <w:p>
-      <w:pPr>
-        <w:jc w:val="both"/>
-        <w:rPr>
-          <w:rFonts w:cs="Carlito"/>
-          <w:b/>
-          <w:bCs/>
-        </w:rPr>
-      </w:pPr>
-      <w:r>
-        <w:rPr>
-          <w:rFonts w:cs="Carlito"/>
-          <w:b/>
-          <w:bCs/>
-        </w:rPr>
-        <w:t>│           @</w:t>
-      </w:r>
-      <w:proofErr w:type="gramStart"/>
-      <w:r>
-        <w:rPr>
-          <w:rFonts w:cs="Carlito"/>
-          <w:b/>
-          <w:bCs/>
-        </w:rPr>
-        <w:t>POST(</w:t>
-      </w:r>
-      <w:proofErr w:type="gramEnd"/>
-      <w:r>
-        <w:rPr>
-          <w:rFonts w:cs="Carlito"/>
-          <w:b/>
-          <w:bCs/>
-        </w:rPr>
-        <w:t>Endpoints.login)       │</w:t>
-      </w:r>
-    </w:p>
-    <w:p>
-      <w:pPr>
-        <w:jc w:val="both"/>
-        <w:rPr>
-          <w:rFonts w:cs="Carlito"/>
-          <w:b/>
-          <w:bCs/>
-        </w:rPr>
-      </w:pPr>
-      <w:r>
-        <w:rPr>
-          <w:rFonts w:cs="Carlito"/>
-          <w:b/>
-          <w:bCs/>
-        </w:rPr>
-        <w:t>│           Future&lt;</w:t>
-      </w:r>
-      <w:proofErr w:type="spellStart"/>
-      <w:r>
-        <w:rPr>
-          <w:rFonts w:cs="Carlito"/>
-          <w:b/>
-          <w:bCs/>
-        </w:rPr>
-        <w:t>HttpResponse</w:t>
-      </w:r>
-      <w:proofErr w:type="spellEnd"/>
-      <w:r>
-        <w:rPr>
-          <w:rFonts w:cs="Carlito"/>
-          <w:b/>
-          <w:bCs/>
-        </w:rPr>
-        <w:t>&gt;         │</w:t>
-      </w:r>
-    </w:p>
-    <w:p>
-      <w:pPr>
-        <w:jc w:val="both"/>
-        <w:rPr>
-          <w:rFonts w:cs="Carlito"/>
-          <w:b/>
-          <w:bCs/>
-        </w:rPr>
-      </w:pPr>
-      <w:r>
-        <w:rPr>
-          <w:rFonts w:cs="Carlito"/>
-          <w:b/>
-          <w:bCs/>
-        </w:rPr>
-        <w:t>│           login(@</w:t>
-      </w:r>
-      <w:proofErr w:type="gramStart"/>
-      <w:r>
-        <w:rPr>
-          <w:rFonts w:cs="Carlito"/>
-          <w:b/>
-          <w:bCs/>
-        </w:rPr>
-        <w:t>Body(</w:t>
-      </w:r>
-      <w:proofErr w:type="gramEnd"/>
-      <w:r>
-        <w:rPr>
-          <w:rFonts w:cs="Carlito"/>
-          <w:b/>
-          <w:bCs/>
-        </w:rPr>
-        <w:t xml:space="preserve">) ...);                   </w:t>
-      </w:r>
-      <w:r>
-        <w:rPr>
-          <w:rFonts w:cs="Carlito"/>
-          <w:b/>
-          <w:bCs/>
-        </w:rPr>
-        <w:t xml:space="preserve"> </w:t>
-      </w:r>
-      <w:r>
-        <w:rPr>
-          <w:rFonts w:cs="Carlito"/>
-          <w:b/>
-          <w:bCs/>
-        </w:rPr>
-        <w:t>│</w:t>
-      </w:r>
-    </w:p>
-    <w:p>
-      <w:pPr>
-        <w:jc w:val="both"/>
-        <w:rPr>
-          <w:rFonts w:cs="Carlito"/>
-          <w:b/>
-          <w:bCs/>
-        </w:rPr>
-      </w:pPr>
-      <w:r>
-        <w:rPr>
-          <w:rFonts w:cs="Carlito"/>
-          <w:b/>
-          <w:bCs/>
-        </w:rPr>
-        <w:t>└──────────────</w:t>
-      </w:r>
-      <w:r>
-        <w:rPr>
-          <w:rFonts w:ascii="Arial" w:hAnsi="Arial" w:cs="Arial"/>
-          <w:b/>
-          <w:bCs/>
-        </w:rPr>
-        <w:t>┬</w:t>
-      </w:r>
-      <w:r>
-        <w:rPr>
-          <w:rFonts w:cs="Carlito"/>
-          <w:b/>
-          <w:bCs/>
-        </w:rPr>
-        <w:t>─────────────┘</w:t>
-      </w:r>
-    </w:p>
-    <w:p>
-      <w:pPr>
-        <w:jc w:val="both"/>
-        <w:rPr>
-          <w:rFonts w:cs="Carlito"/>
-          <w:b/>
-          <w:bCs/>
-        </w:rPr>
-      </w:pPr>
-      <w:r>
-        <w:rPr>
-          <w:rFonts w:cs="Carlito"/>
-          <w:b/>
-          <w:bCs/>
-        </w:rPr>
-        <w:t xml:space="preserve">                                 </w:t>
-      </w:r>
-      <w:proofErr w:type="gramStart"/>
-      <w:r>
-        <w:rPr>
-          <w:rFonts w:cs="Carlito"/>
-          <w:b/>
-          <w:bCs/>
-        </w:rPr>
-        <w:t>│  we</w:t>
-      </w:r>
-      <w:proofErr w:type="gramEnd"/>
-      <w:r>
-        <w:rPr>
-          <w:rFonts w:cs="Carlito"/>
-          <w:b/>
-          <w:bCs/>
-        </w:rPr>
-        <w:t xml:space="preserve"> run: dart run </w:t>
-      </w:r>
-      <w:proofErr w:type="spellStart"/>
-      <w:r>
-        <w:rPr>
-          <w:rFonts w:cs="Carlito"/>
-          <w:b/>
-          <w:bCs/>
-        </w:rPr>
-        <w:t>build_runner</w:t>
-      </w:r>
-      <w:proofErr w:type="spellEnd"/>
-      <w:r>
-        <w:rPr>
-          <w:rFonts w:cs="Carlito"/>
-          <w:b/>
-          <w:bCs/>
-        </w:rPr>
-        <w:t xml:space="preserve"> build</w:t>
-      </w:r>
-    </w:p>
-    <w:p>
-      <w:pPr>
-        <w:jc w:val="both"/>
-        <w:rPr>
-          <w:rFonts w:cs="Carlito"/>
-          <w:b/>
-          <w:bCs/>
-        </w:rPr>
-      </w:pPr>
-      <w:r>
-        <w:rPr>
-          <w:rFonts w:cs="Carlito"/>
-          <w:b/>
-          <w:bCs/>
-        </w:rPr>
-        <w:t xml:space="preserve">                                </w:t>
-      </w:r>
-      <w:r>
-        <w:rPr>
-          <w:rFonts w:ascii="Arial" w:hAnsi="Arial" w:cs="Arial"/>
-          <w:b/>
-          <w:bCs/>
-        </w:rPr>
-        <w:t>▼</w:t>
-      </w:r>
-    </w:p>
-    <w:p>
-      <w:pPr>
-        <w:jc w:val="both"/>
-        <w:rPr>
-          <w:rFonts w:cs="Carlito"/>
-          <w:b/>
-          <w:bCs/>
-        </w:rPr>
-      </w:pPr>
-      <w:r>
-        <w:rPr>
-          <w:rFonts w:cs="Carlito"/>
-          <w:b/>
-          <w:bCs/>
-        </w:rPr>
-        <w:t>┌─────────────────────────────┐</w:t>
-      </w:r>
-    </w:p>
-    <w:p>
-      <w:pPr>
-        <w:jc w:val="both"/>
-        <w:rPr>
-          <w:rFonts w:cs="Carlito"/>
-          <w:b/>
-          <w:bCs/>
-        </w:rPr>
-      </w:pPr>
-      <w:proofErr w:type="gramStart"/>
-      <w:r>
-        <w:rPr>
-          <w:rFonts w:cs="Carlito"/>
-          <w:b/>
-          <w:bCs/>
-        </w:rPr>
-        <w:t xml:space="preserve">│  </w:t>
-      </w:r>
-      <w:proofErr w:type="spellStart"/>
-      <w:r>
-        <w:rPr>
-          <w:rFonts w:cs="Carlito"/>
-          <w:b/>
-          <w:bCs/>
-        </w:rPr>
-        <w:t>source</w:t>
-      </w:r>
-      <w:proofErr w:type="gramEnd"/>
-      <w:r>
-        <w:rPr>
-          <w:rFonts w:cs="Carlito"/>
-          <w:b/>
-          <w:bCs/>
-        </w:rPr>
-        <w:t>_gen</w:t>
-      </w:r>
-      <w:proofErr w:type="spellEnd"/>
-      <w:r>
-        <w:rPr>
-          <w:rFonts w:cs="Carlito"/>
-          <w:b/>
-          <w:bCs/>
-        </w:rPr>
-        <w:t xml:space="preserve"> + </w:t>
-      </w:r>
-      <w:proofErr w:type="spellStart"/>
-      <w:r>
-        <w:rPr>
-          <w:rFonts w:cs="Carlito"/>
-          <w:b/>
-          <w:bCs/>
-        </w:rPr>
-        <w:t>retrofit_generator</w:t>
-      </w:r>
-      <w:proofErr w:type="spellEnd"/>
-      <w:r>
-        <w:rPr>
-          <w:rFonts w:cs="Carlito"/>
-          <w:b/>
-          <w:bCs/>
-        </w:rPr>
-        <w:t xml:space="preserve"> </w:t>
-      </w:r>
-      <w:r>
-        <w:rPr>
-          <w:rFonts w:cs="Carlito"/>
-          <w:b/>
-          <w:bCs/>
-        </w:rPr>
-        <w:t xml:space="preserve">   </w:t>
-      </w:r>
-      <w:r>
-        <w:rPr>
-          <w:rFonts w:cs="Carlito"/>
-          <w:b/>
-          <w:bCs/>
-        </w:rPr>
-        <w:t>│  ← reads our annotations</w:t>
-      </w:r>
-    </w:p>
-    <w:p>
-      <w:pPr>
-        <w:jc w:val="both"/>
-        <w:rPr>
-          <w:rFonts w:cs="Carlito"/>
-          <w:b/>
-          <w:bCs/>
-        </w:rPr>
-      </w:pPr>
-      <w:proofErr w:type="gramStart"/>
-      <w:r>
-        <w:rPr>
-          <w:rFonts w:cs="Carlito"/>
-          <w:b/>
-          <w:bCs/>
-        </w:rPr>
-        <w:t>│  (</w:t>
-      </w:r>
-      <w:proofErr w:type="gramEnd"/>
-      <w:r>
-        <w:rPr>
-          <w:rFonts w:cs="Carlito"/>
-          <w:b/>
-          <w:bCs/>
-        </w:rPr>
-        <w:t xml:space="preserve">build-time tool, not runtime)  </w:t>
-      </w:r>
-      <w:r>
-        <w:rPr>
-          <w:rFonts w:cs="Carlito"/>
-          <w:b/>
-          <w:bCs/>
-        </w:rPr>
-        <w:t xml:space="preserve">      </w:t>
-      </w:r>
-      <w:r>
-        <w:rPr>
-          <w:rFonts w:cs="Carlito"/>
-          <w:b/>
-          <w:bCs/>
-        </w:rPr>
-        <w:t>│     writes real Dio calls</w:t>
-      </w:r>
-    </w:p>
-    <w:p>
-      <w:pPr>
-        <w:jc w:val="both"/>
-        <w:rPr>
-          <w:rFonts w:cs="Carlito"/>
-          <w:b/>
-          <w:bCs/>
-        </w:rPr>
-      </w:pPr>
-      <w:r>
-        <w:rPr>
-          <w:rFonts w:cs="Carlito"/>
-          <w:b/>
-          <w:bCs/>
-        </w:rPr>
-        <w:t>└──────────────</w:t>
-      </w:r>
-      <w:r>
-        <w:rPr>
-          <w:rFonts w:ascii="Arial" w:hAnsi="Arial" w:cs="Arial"/>
-          <w:b/>
-          <w:bCs/>
-        </w:rPr>
-        <w:t>┬</w:t>
-      </w:r>
-      <w:r>
-        <w:rPr>
-          <w:rFonts w:cs="Carlito"/>
-          <w:b/>
-          <w:bCs/>
-        </w:rPr>
-        <w:t>──────────────┘</w:t>
-      </w:r>
-    </w:p>
-    <w:p>
-      <w:pPr>
-        <w:jc w:val="both"/>
-        <w:rPr>
-          <w:rFonts w:cs="Carlito"/>
-          <w:b/>
-          <w:bCs/>
-        </w:rPr>
-      </w:pPr>
-      <w:r>
-        <w:rPr>
-          <w:rFonts w:cs="Carlito"/>
-          <w:b/>
-          <w:bCs/>
-        </w:rPr>
-        <w:t xml:space="preserve">           </w:t>
+        <w:t xml:space="preserve">             </w:t>
       </w:r>
       <w:r>
         <w:rPr>
@@ -2809,440 +3253,6 @@
           <w:b/>
           <w:bCs/>
         </w:rPr>
-        <w:t xml:space="preserve">    │</w:t>
-      </w:r>
-    </w:p>
-    <w:p>
-      <w:pPr>
-        <w:jc w:val="both"/>
-        <w:rPr>
-          <w:rFonts w:cs="Carlito"/>
-          <w:b/>
-          <w:bCs/>
-        </w:rPr>
-      </w:pPr>
-      <w:r>
-        <w:rPr>
-          <w:rFonts w:cs="Carlito"/>
-          <w:b/>
-          <w:bCs/>
-        </w:rPr>
-        <w:t xml:space="preserve">              </w:t>
-      </w:r>
-      <w:r>
-        <w:rPr>
-          <w:rFonts w:cs="Carlito"/>
-          <w:b/>
-          <w:bCs/>
-        </w:rPr>
-        <w:t xml:space="preserve">                  </w:t>
-      </w:r>
-      <w:r>
-        <w:rPr>
-          <w:rFonts w:cs="Carlito"/>
-          <w:b/>
-          <w:bCs/>
-        </w:rPr>
-        <w:t xml:space="preserve"> </w:t>
-      </w:r>
-      <w:r>
-        <w:rPr>
-          <w:rFonts w:ascii="Arial" w:hAnsi="Arial" w:cs="Arial"/>
-          <w:b/>
-          <w:bCs/>
-        </w:rPr>
-        <w:t>▼</w:t>
-      </w:r>
-    </w:p>
-    <w:p>
-      <w:pPr>
-        <w:jc w:val="both"/>
-        <w:rPr>
-          <w:rFonts w:cs="Carlito"/>
-          <w:b/>
-          <w:bCs/>
-        </w:rPr>
-      </w:pPr>
-      <w:r>
-        <w:rPr>
-          <w:rFonts w:cs="Carlito"/>
-          <w:b/>
-          <w:bCs/>
-        </w:rPr>
-        <w:t>┌─────────────────────────────┐</w:t>
-      </w:r>
-    </w:p>
-    <w:p>
-      <w:pPr>
-        <w:jc w:val="both"/>
-        <w:rPr>
-          <w:rFonts w:cs="Carlito"/>
-          <w:b/>
-          <w:bCs/>
-        </w:rPr>
-      </w:pPr>
-      <w:proofErr w:type="gramStart"/>
-      <w:r>
-        <w:rPr>
-          <w:rFonts w:cs="Carlito"/>
-          <w:b/>
-          <w:bCs/>
-        </w:rPr>
-        <w:t xml:space="preserve">│  </w:t>
-      </w:r>
-      <w:proofErr w:type="spellStart"/>
-      <w:r>
-        <w:rPr>
-          <w:rFonts w:cs="Carlito"/>
-          <w:b/>
-          <w:bCs/>
-        </w:rPr>
-        <w:t>rest</w:t>
-      </w:r>
-      <w:proofErr w:type="gramEnd"/>
-      <w:r>
-        <w:rPr>
-          <w:rFonts w:cs="Carlito"/>
-          <w:b/>
-          <w:bCs/>
-        </w:rPr>
-        <w:t>_client.g.dart</w:t>
-      </w:r>
-      <w:proofErr w:type="spellEnd"/>
-      <w:r>
-        <w:rPr>
-          <w:rFonts w:cs="Carlito"/>
-          <w:b/>
-          <w:bCs/>
-        </w:rPr>
-        <w:t xml:space="preserve"> (generated)</w:t>
-      </w:r>
-      <w:r>
-        <w:rPr>
-          <w:rFonts w:cs="Carlito"/>
-          <w:b/>
-          <w:bCs/>
-        </w:rPr>
-        <w:t xml:space="preserve">        </w:t>
-      </w:r>
-      <w:r>
-        <w:rPr>
-          <w:rFonts w:cs="Carlito"/>
-          <w:b/>
-          <w:bCs/>
-        </w:rPr>
-        <w:t>│  ← _</w:t>
-      </w:r>
-      <w:proofErr w:type="spellStart"/>
-      <w:r>
-        <w:rPr>
-          <w:rFonts w:cs="Carlito"/>
-          <w:b/>
-          <w:bCs/>
-        </w:rPr>
-        <w:t>RestClient</w:t>
-      </w:r>
-      <w:proofErr w:type="spellEnd"/>
-      <w:r>
-        <w:rPr>
-          <w:rFonts w:cs="Carlito"/>
-          <w:b/>
-          <w:bCs/>
-        </w:rPr>
-        <w:t xml:space="preserve"> class lives here</w:t>
-      </w:r>
-    </w:p>
-    <w:p>
-      <w:pPr>
-        <w:jc w:val="both"/>
-        <w:rPr>
-          <w:rFonts w:cs="Carlito"/>
-          <w:b/>
-          <w:bCs/>
-        </w:rPr>
-      </w:pPr>
-      <w:proofErr w:type="gramStart"/>
-      <w:r>
-        <w:rPr>
-          <w:rFonts w:cs="Carlito"/>
-          <w:b/>
-          <w:bCs/>
-        </w:rPr>
-        <w:t>│  class</w:t>
-      </w:r>
-      <w:proofErr w:type="gramEnd"/>
-      <w:r>
-        <w:rPr>
-          <w:rFonts w:cs="Carlito"/>
-          <w:b/>
-          <w:bCs/>
-        </w:rPr>
-        <w:t xml:space="preserve"> _</w:t>
-      </w:r>
-      <w:proofErr w:type="spellStart"/>
-      <w:r>
-        <w:rPr>
-          <w:rFonts w:cs="Carlito"/>
-          <w:b/>
-          <w:bCs/>
-        </w:rPr>
-        <w:t>RestClient</w:t>
-      </w:r>
-      <w:proofErr w:type="spellEnd"/>
-      <w:r>
-        <w:rPr>
-          <w:rFonts w:cs="Carlito"/>
-          <w:b/>
-          <w:bCs/>
-        </w:rPr>
-        <w:t xml:space="preserve"> extends    </w:t>
-      </w:r>
-      <w:r>
-        <w:rPr>
-          <w:rFonts w:cs="Carlito"/>
-          <w:b/>
-          <w:bCs/>
-        </w:rPr>
-        <w:t xml:space="preserve">           </w:t>
-      </w:r>
-      <w:r>
-        <w:rPr>
-          <w:rFonts w:cs="Carlito"/>
-          <w:b/>
-          <w:bCs/>
-        </w:rPr>
-        <w:t xml:space="preserve"> │     ACTUAL </w:t>
-      </w:r>
-      <w:proofErr w:type="spellStart"/>
-      <w:r>
-        <w:rPr>
-          <w:rFonts w:cs="Carlito"/>
-          <w:b/>
-          <w:bCs/>
-        </w:rPr>
-        <w:t>dio.post</w:t>
-      </w:r>
-      <w:proofErr w:type="spellEnd"/>
-      <w:r>
-        <w:rPr>
-          <w:rFonts w:cs="Carlito"/>
-          <w:b/>
-          <w:bCs/>
-        </w:rPr>
-        <w:t>(...) calls</w:t>
-      </w:r>
-    </w:p>
-    <w:p>
-      <w:pPr>
-        <w:jc w:val="both"/>
-        <w:rPr>
-          <w:rFonts w:cs="Carlito"/>
-          <w:b/>
-          <w:bCs/>
-        </w:rPr>
-      </w:pPr>
-      <w:r>
-        <w:rPr>
-          <w:rFonts w:cs="Carlito"/>
-          <w:b/>
-          <w:bCs/>
-        </w:rPr>
-        <w:t xml:space="preserve">│    </w:t>
-      </w:r>
-      <w:proofErr w:type="spellStart"/>
-      <w:r>
-        <w:rPr>
-          <w:rFonts w:cs="Carlito"/>
-          <w:b/>
-          <w:bCs/>
-        </w:rPr>
-        <w:t>RestClient</w:t>
-      </w:r>
-      <w:proofErr w:type="spellEnd"/>
-      <w:r>
-        <w:rPr>
-          <w:rFonts w:cs="Carlito"/>
-          <w:b/>
-          <w:bCs/>
-        </w:rPr>
-        <w:t xml:space="preserve"> </w:t>
-      </w:r>
-      <w:proofErr w:type="gramStart"/>
-      <w:r>
-        <w:rPr>
-          <w:rFonts w:cs="Carlito"/>
-          <w:b/>
-          <w:bCs/>
-        </w:rPr>
-        <w:t xml:space="preserve">{  </w:t>
-      </w:r>
-      <w:proofErr w:type="gramEnd"/>
-      <w:r>
-        <w:rPr>
-          <w:rFonts w:cs="Carlito"/>
-          <w:b/>
-          <w:bCs/>
-        </w:rPr>
-        <w:t xml:space="preserve">            </w:t>
-      </w:r>
-      <w:r>
-        <w:rPr>
-          <w:rFonts w:cs="Carlito"/>
-          <w:b/>
-          <w:bCs/>
-        </w:rPr>
-        <w:t xml:space="preserve">                       </w:t>
-      </w:r>
-      <w:r>
-        <w:rPr>
-          <w:rFonts w:cs="Carlito"/>
-          <w:b/>
-          <w:bCs/>
-        </w:rPr>
-        <w:t xml:space="preserve">  │     written FOR </w:t>
-      </w:r>
-      <w:r>
-        <w:rPr>
-          <w:rFonts w:cs="Carlito"/>
-          <w:b/>
-          <w:bCs/>
-        </w:rPr>
-        <w:t>us</w:t>
-      </w:r>
-    </w:p>
-    <w:p>
-      <w:pPr>
-        <w:jc w:val="both"/>
-        <w:rPr>
-          <w:rFonts w:cs="Carlito"/>
-          <w:b/>
-          <w:bCs/>
-        </w:rPr>
-      </w:pPr>
-      <w:r>
-        <w:rPr>
-          <w:rFonts w:cs="Carlito"/>
-          <w:b/>
-          <w:bCs/>
-        </w:rPr>
-        <w:t xml:space="preserve">│    ...real implementation...   </w:t>
-      </w:r>
-      <w:r>
-        <w:rPr>
-          <w:rFonts w:cs="Carlito"/>
-          <w:b/>
-          <w:bCs/>
-        </w:rPr>
-        <w:t xml:space="preserve">            </w:t>
-      </w:r>
-      <w:r>
-        <w:rPr>
-          <w:rFonts w:cs="Carlito"/>
-          <w:b/>
-          <w:bCs/>
-        </w:rPr>
-        <w:t>│</w:t>
-      </w:r>
-    </w:p>
-    <w:p>
-      <w:pPr>
-        <w:jc w:val="both"/>
-        <w:rPr>
-          <w:rFonts w:cs="Carlito"/>
-          <w:b/>
-          <w:bCs/>
-        </w:rPr>
-      </w:pPr>
-      <w:r>
-        <w:rPr>
-          <w:rFonts w:cs="Carlito"/>
-          <w:b/>
-          <w:bCs/>
-        </w:rPr>
-        <w:t xml:space="preserve">│  }                              </w:t>
-      </w:r>
-      <w:r>
-        <w:rPr>
-          <w:rFonts w:cs="Carlito"/>
-          <w:b/>
-          <w:bCs/>
-        </w:rPr>
-        <w:t xml:space="preserve">                              </w:t>
-      </w:r>
-      <w:r>
-        <w:rPr>
-          <w:rFonts w:cs="Carlito"/>
-          <w:b/>
-          <w:bCs/>
-        </w:rPr>
-        <w:t>│</w:t>
-      </w:r>
-    </w:p>
-    <w:p>
-      <w:pPr>
-        <w:jc w:val="both"/>
-        <w:rPr>
-          <w:rFonts w:cs="Carlito"/>
-          <w:b/>
-          <w:bCs/>
-        </w:rPr>
-      </w:pPr>
-      <w:r>
-        <w:rPr>
-          <w:rFonts w:cs="Carlito"/>
-          <w:b/>
-          <w:bCs/>
-        </w:rPr>
-        <w:t>└──────────────</w:t>
-      </w:r>
-      <w:r>
-        <w:rPr>
-          <w:rFonts w:ascii="Arial" w:hAnsi="Arial" w:cs="Arial"/>
-          <w:b/>
-          <w:bCs/>
-        </w:rPr>
-        <w:t>┬</w:t>
-      </w:r>
-      <w:r>
-        <w:rPr>
-          <w:rFonts w:cs="Carlito"/>
-          <w:b/>
-          <w:bCs/>
-        </w:rPr>
-        <w:t>─────────────┘</w:t>
-      </w:r>
-    </w:p>
-    <w:p>
-      <w:pPr>
-        <w:jc w:val="both"/>
-        <w:rPr>
-          <w:rFonts w:cs="Carlito"/>
-          <w:b/>
-          <w:bCs/>
-        </w:rPr>
-      </w:pPr>
-      <w:r>
-        <w:rPr>
-          <w:rFonts w:cs="Carlito"/>
-          <w:b/>
-          <w:bCs/>
-        </w:rPr>
-        <w:t xml:space="preserve">             </w:t>
-      </w:r>
-      <w:r>
-        <w:rPr>
-          <w:rFonts w:cs="Carlito"/>
-          <w:b/>
-          <w:bCs/>
-        </w:rPr>
-        <w:t xml:space="preserve">                   </w:t>
-      </w:r>
-      <w:r>
-        <w:rPr>
-          <w:rFonts w:cs="Carlito"/>
-          <w:b/>
-          <w:bCs/>
-        </w:rPr>
         <w:t xml:space="preserve">  │</w:t>
       </w:r>
     </w:p>
@@ -3261,7 +3271,6 @@
           <w:b/>
           <w:bCs/>
         </w:rPr>
-        <w:lastRenderedPageBreak/>
         <w:t xml:space="preserve">               </w:t>
       </w:r>
       <w:r>
@@ -49192,7 +49201,7 @@
       </w:pPr>
     </w:p>
     <w:sectPr>
-      <w:footerReference w:type="default" r:id="rId7"/>
+      <w:footerReference w:type="default" r:id="rId8"/>
       <w:pgSz w:w="11906" w:h="16838" w:code="9"/>
       <w:pgMar w:top="1440" w:right="1440" w:bottom="1440" w:left="1440" w:header="720" w:footer="720" w:gutter="0"/>
       <w:cols w:space="720"/>
@@ -51465,4 +51474,16 @@
     </a:ext>
   </a:extLst>
 </a:theme>
+</file>
+
+<file path=customXml/item1.xml><?xml version="1.0" encoding="utf-8"?>
+<b:Sources xmlns:b="http://schemas.openxmlformats.org/officeDocument/2006/bibliography" xmlns="http://schemas.openxmlformats.org/officeDocument/2006/bibliography" SelectedStyle="\APASixthEditionOfficeOnline.xsl" StyleName="APA" Version="6"/>
+</file>
+
+<file path=customXml/itemProps1.xml><?xml version="1.0" encoding="utf-8"?>
+<ds:datastoreItem xmlns:ds="http://schemas.openxmlformats.org/officeDocument/2006/customXml" ds:itemID="{BB73056A-F82F-4EE9-BEC1-28DE97FE7D9C}">
+  <ds:schemaRefs>
+    <ds:schemaRef ds:uri="http://schemas.openxmlformats.org/officeDocument/2006/bibliography"/>
+  </ds:schemaRefs>
+</ds:datastoreItem>
 </file>
</xml_diff>